<commit_message>
Add HarmonyCare to Work with role-accurate framing
HarmonyCare is a team mobile programming course project where the portfolio
owner's role was architecture and technical design plus testing. It is listed
accordingly: course-team chip, explicit "My role" line, and contributor credit
left intact in the linked repository.

- Work: new project 04 card (architecture, testing, offline-first design,
  accessibility), add Android to the hero chips and profile focus
- Skills: new Mobile column (Java, Android SDK 34, Room + MVVM, offline-first
  networking); skills grid moves to a balanced 2x2
- Hero and Work lede no longer imply every project carries its own test suite
- CV: add HarmonyCare block, Java/Android skills, and replace the "450+
  timezones" phrasing with full IANA timezone support
- README: record the attribution rule for team projects

Co-authored-by: arena-agent <297053741+arena-agent@users.noreply.github.com>
</commit_message>
<xml_diff>
--- a/cv-ats.docx
+++ b/cv-ats.docx
@@ -85,7 +85,7 @@
           <w:b w:val="0"/>
           <w:sz w:val="21"/>
         </w:rPr>
-        <w:t>Hands-on experience building tested and reproducible software: an adversarial LLM security benchmark, a full-stack B2B web platform, and a desktop analytics application.</w:t>
+        <w:t>Hands-on experience building tested and reproducible software: an adversarial LLM security benchmark, a full-stack B2B web platform, a desktop analytics application, and an Android safety app built with a course team (architecture and testing).</w:t>
       </w:r>
     </w:p>
     <w:p>
@@ -454,7 +454,7 @@
           <w:b w:val="0"/>
           <w:sz w:val="21"/>
         </w:rPr>
-        <w:t>- Built a desktop expense tracker with charts, category insights, CSV/JSON import/export, and a 450+ timezone system</w:t>
+        <w:t>- Built a desktop expense tracker with charts, category insights, CSV/JSON import/export, and full IANA timezone support</w:t>
       </w:r>
     </w:p>
     <w:p>
@@ -467,6 +467,78 @@
           <w:sz w:val="21"/>
         </w:rPr>
         <w:t>- Wrote 80+ passing unit tests and a documented developer workflow</w:t>
+      </w:r>
+    </w:p>
+    <w:p>
+      <w:pPr>
+        <w:spacing w:before="0" w:after="40"/>
+      </w:pPr>
+      <w:r>
+        <w:rPr>
+          <w:b w:val="0"/>
+          <w:sz w:val="21"/>
+        </w:rPr>
+        <w:t>HarmonyCare - Elderly Safety and Volunteer Response App (Android, course team project)</w:t>
+      </w:r>
+    </w:p>
+    <w:p>
+      <w:pPr>
+        <w:spacing w:before="0" w:after="40"/>
+      </w:pPr>
+      <w:r>
+        <w:rPr>
+          <w:b w:val="0"/>
+          <w:sz w:val="21"/>
+        </w:rPr>
+        <w:t>Technologies: Java, Android SDK 34, Room, MVVM, Material Design, AMap and OSMDroid</w:t>
+      </w:r>
+    </w:p>
+    <w:p>
+      <w:pPr>
+        <w:spacing w:before="0" w:after="40"/>
+      </w:pPr>
+      <w:r>
+        <w:rPr>
+          <w:b w:val="0"/>
+          <w:sz w:val="21"/>
+        </w:rPr>
+        <w:t>- Role: architecture and technical design for a team of students; defined the MVVM and repository layering, the Room data model, and the offline-first emergency flow</w:t>
+      </w:r>
+    </w:p>
+    <w:p>
+      <w:pPr>
+        <w:spacing w:before="0" w:after="40"/>
+      </w:pPr>
+      <w:r>
+        <w:rPr>
+          <w:b w:val="0"/>
+          <w:sz w:val="21"/>
+        </w:rPr>
+        <w:t>- Owned the test plan and manual QA across the elderly and volunteer journeys, covering emergency alerting, map navigation, chat, and reminders</w:t>
+      </w:r>
+    </w:p>
+    <w:p>
+      <w:pPr>
+        <w:spacing w:before="0" w:after="40"/>
+      </w:pPr>
+      <w:r>
+        <w:rPr>
+          <w:b w:val="0"/>
+          <w:sz w:val="21"/>
+        </w:rPr>
+        <w:t>- Offline-first design: an alert is queued on the device and broadcast over the local WiFi network, so nearby volunteers can be reached with no server and no internet</w:t>
+      </w:r>
+    </w:p>
+    <w:p>
+      <w:pPr>
+        <w:spacing w:before="0" w:after="40"/>
+      </w:pPr>
+      <w:r>
+        <w:rPr>
+          <w:b w:val="0"/>
+          <w:sz w:val="21"/>
+        </w:rPr>
+        <w:t>- Accessibility for elderly users: confirmation countdown before an alert, text-to-speech and haptic feedback, large-text mode, and English/Bengali localization</w:t>
       </w:r>
     </w:p>
     <w:p>
@@ -490,7 +562,7 @@
           <w:b w:val="0"/>
           <w:sz w:val="21"/>
         </w:rPr>
-        <w:t>Programming: Python, JavaScript, TypeScript, HTML, CSS, SQL</w:t>
+        <w:t>Programming: Python, JavaScript, TypeScript, Java, HTML, CSS, SQL</w:t>
       </w:r>
     </w:p>
     <w:p>
@@ -502,7 +574,7 @@
           <w:b w:val="0"/>
           <w:sz w:val="21"/>
         </w:rPr>
-        <w:t>Frameworks and libraries: React, Vite, Node.js, Express, Prisma ORM, Pandas, Plotly, Tkinter, asyncio, aiohttp, Pydantic</w:t>
+        <w:t>Frameworks and libraries: React, Vite, Node.js, Express, Prisma ORM, Android SDK (Room, MVVM), Pandas, Plotly, Tkinter, asyncio, aiohttp, Pydantic</w:t>
       </w:r>
     </w:p>
     <w:p>
@@ -514,7 +586,7 @@
           <w:b w:val="0"/>
           <w:sz w:val="21"/>
         </w:rPr>
-        <w:t>Tools and platforms: Docker, docker-compose, SQLite, Git, GitHub</w:t>
+        <w:t>Tools and platforms: Docker, docker-compose, SQLite, Git, GitHub, Android Studio</w:t>
       </w:r>
     </w:p>
     <w:p>
@@ -526,7 +598,7 @@
           <w:b w:val="0"/>
           <w:sz w:val="21"/>
         </w:rPr>
-        <w:t>Concepts: REST APIs, concurrency, unit testing (pytest), data analysis, prompt engineering, LLM security evaluation</w:t>
+        <w:t>Concepts: REST APIs, concurrency, unit testing, data analysis, prompt engineering, LLM security evaluation, offline-first mobile design</w:t>
       </w:r>
     </w:p>
     <w:p>

</xml_diff>

<commit_message>
Add UrbanAI as a team competition prototype (project 05)
Framed around the actual contribution: concept, feature scope, and the
competition presentation, with the prototype implementation credited to the
teammate who led it. The card also states the prototype's real limits.

- Work: project 05 card (16-module scope, Next.js/Prisma/Three.js stack, honest
  note that AI features are LLM API calls and some modules use demo data)
- Experience: the 2025 competition entry now links its prototype repository
- Skills: Next.js in Web, JWT authentication in Backend
- Hero and Work lede reflect that two of the five projects were team work
- CV: UrbanAI block, Next.js and JWT in skills, summary updated
- README: UrbanAI framing rule alongside the HarmonyCare one

Co-authored-by: arena-agent <297053741+arena-agent@users.noreply.github.com>
</commit_message>
<xml_diff>
--- a/cv-ats.docx
+++ b/cv-ats.docx
@@ -85,7 +85,7 @@
           <w:b w:val="0"/>
           <w:sz w:val="21"/>
         </w:rPr>
-        <w:t>Hands-on experience building tested and reproducible software: an adversarial LLM security benchmark, a full-stack B2B web platform, a desktop analytics application, and an Android safety app built with a course team (architecture and testing).</w:t>
+        <w:t>Hands-on experience building tested and reproducible software: an adversarial LLM security benchmark, a full-stack B2B web platform, a desktop analytics application, and two team projects (an Android safety app where I owned architecture and testing, and a smart-city competition prototype).</w:t>
       </w:r>
     </w:p>
     <w:p>
@@ -543,6 +543,54 @@
     </w:p>
     <w:p>
       <w:pPr>
+        <w:spacing w:before="0" w:after="40"/>
+      </w:pPr>
+      <w:r>
+        <w:rPr>
+          <w:b w:val="0"/>
+          <w:sz w:val="21"/>
+        </w:rPr>
+        <w:t>UrbanAI - Smart City Planning Prototype (team competition entry)</w:t>
+      </w:r>
+    </w:p>
+    <w:p>
+      <w:pPr>
+        <w:spacing w:before="0" w:after="40"/>
+      </w:pPr>
+      <w:r>
+        <w:rPr>
+          <w:b w:val="0"/>
+          <w:sz w:val="21"/>
+        </w:rPr>
+        <w:t>Technologies: Next.js, React, TypeScript, Prisma, Three.js, Leaflet, DeepSeek API</w:t>
+      </w:r>
+    </w:p>
+    <w:p>
+      <w:pPr>
+        <w:spacing w:before="0" w:after="40"/>
+      </w:pPr>
+      <w:r>
+        <w:rPr>
+          <w:b w:val="0"/>
+          <w:sz w:val="21"/>
+        </w:rPr>
+        <w:t>- Team member in the 2025 China International College Students' Innovation Competition; contributed to the concept, feature scope, and the competition presentation (prototype implementation led by a teammate)</w:t>
+      </w:r>
+    </w:p>
+    <w:p>
+      <w:pPr>
+        <w:spacing w:before="0" w:after="40"/>
+      </w:pPr>
+      <w:r>
+        <w:rPr>
+          <w:b w:val="0"/>
+          <w:sz w:val="21"/>
+        </w:rPr>
+        <w:t>- Prototype spans 16 dashboard modules for urban planning (traffic, resources, green spaces, weather, simulations) with a 3D city view, JWT authentication, and an English/Chinese/Bengali interface</w:t>
+      </w:r>
+    </w:p>
+    <w:p>
+      <w:pPr>
         <w:spacing w:before="160" w:after="60"/>
       </w:pPr>
       <w:r>
@@ -574,7 +622,7 @@
           <w:b w:val="0"/>
           <w:sz w:val="21"/>
         </w:rPr>
-        <w:t>Frameworks and libraries: React, Vite, Node.js, Express, Prisma ORM, Android SDK (Room, MVVM), Pandas, Plotly, Tkinter, asyncio, aiohttp, Pydantic</w:t>
+        <w:t>Frameworks and libraries: React, Next.js, Vite, Node.js, Express, Prisma ORM, Android SDK (Room, MVVM), Pandas, Plotly, Tkinter, asyncio, aiohttp, Pydantic</w:t>
       </w:r>
     </w:p>
     <w:p>
@@ -598,7 +646,7 @@
           <w:b w:val="0"/>
           <w:sz w:val="21"/>
         </w:rPr>
-        <w:t>Concepts: REST APIs, concurrency, unit testing, data analysis, prompt engineering, LLM security evaluation, offline-first mobile design</w:t>
+        <w:t>Concepts: REST APIs, JWT authentication, concurrency, unit testing, data analysis, prompt engineering, LLM security evaluation, offline-first mobile design</w:t>
       </w:r>
     </w:p>
     <w:p>

</xml_diff>

<commit_message>
Correct UrbanAI to the actual contribution: scoping and documentation
The previous card over-credited the role. It now states that the owner
contributed feature scoping and documentation guidelines, did not write the
application code, and did not own the concept or the competition presentation.

- Work: role line and bullets rewritten; result line states the part played
- Experience: competition entry credits scoping and documentation only
- Skills: drop Next.js, which came only from a project the owner did not
  implement (JWT stays - the B2B platform in this portfolio uses it)
- Hero: names the UrbanAI contribution accurately
- CV: role line, team-built project description, Next.js removed from skills
- README: rule that skills must trace to work the owner built, and that
  UrbanAI tags are never skills

Co-authored-by: arena-agent <297053741+arena-agent@users.noreply.github.com>
</commit_message>
<xml_diff>
--- a/cv-ats.docx
+++ b/cv-ats.docx
@@ -85,7 +85,7 @@
           <w:b w:val="0"/>
           <w:sz w:val="21"/>
         </w:rPr>
-        <w:t>Hands-on experience building tested and reproducible software: an adversarial LLM security benchmark, a full-stack B2B web platform, a desktop analytics application, and two team projects (an Android safety app where I owned architecture and testing, and a smart-city competition prototype).</w:t>
+        <w:t>Hands-on experience building tested and reproducible software: an adversarial LLM security benchmark, a full-stack B2B web platform, a desktop analytics application, and two team projects (an Android safety app where I owned architecture and testing, and a smart-city competition prototype where I worked on feature scoping and documentation).</w:t>
       </w:r>
     </w:p>
     <w:p>
@@ -574,7 +574,7 @@
           <w:b w:val="0"/>
           <w:sz w:val="21"/>
         </w:rPr>
-        <w:t>- Team member in the 2025 China International College Students' Innovation Competition; contributed to the concept, feature scope, and the competition presentation (prototype implementation led by a teammate)</w:t>
+        <w:t>- Team member in the 2025 China International College Students' Innovation Competition; contributed feature scoping and documentation guidelines (the implementation was led by a teammate)</w:t>
       </w:r>
     </w:p>
     <w:p>
@@ -586,7 +586,7 @@
           <w:b w:val="0"/>
           <w:sz w:val="21"/>
         </w:rPr>
-        <w:t>- Prototype spans 16 dashboard modules for urban planning (traffic, resources, green spaces, weather, simulations) with a 3D city view, JWT authentication, and an English/Chinese/Bengali interface</w:t>
+        <w:t>- Team-built prototype spans 16 dashboard modules for urban planning (traffic, resources, green spaces, weather, simulations) with a 3D city view and an English/Chinese/Bengali interface</w:t>
       </w:r>
     </w:p>
     <w:p>
@@ -622,7 +622,7 @@
           <w:b w:val="0"/>
           <w:sz w:val="21"/>
         </w:rPr>
-        <w:t>Frameworks and libraries: React, Next.js, Vite, Node.js, Express, Prisma ORM, Android SDK (Room, MVVM), Pandas, Plotly, Tkinter, asyncio, aiohttp, Pydantic</w:t>
+        <w:t>Frameworks and libraries: React, Vite, Node.js, Express, Prisma ORM, Android SDK (Room, MVVM), Pandas, Plotly, Tkinter, asyncio, aiohttp, Pydantic</w:t>
       </w:r>
     </w:p>
     <w:p>

</xml_diff>

<commit_message>
Label solo work explicitly across the Work section
Every project now states its authorship the same way, so a reviewer can scan
roles without reading bullets.

- index.html: "Solo project" chips on the B2B platform and IODEX; a role line on
  the featured benchmark ("solo project - designed, built, ran, and documented")
- styles.css: role-line style shared between the featured card and project cards
- cv-ats.docx: "(solo project)" markers on both solo projects
- README.md: rule that solo and team work carry consistent role markers

Co-authored-by: arena-agent <297053741+arena-agent@users.noreply.github.com>
</commit_message>
<xml_diff>
--- a/cv-ats.docx
+++ b/cv-ats.docx
@@ -371,7 +371,7 @@
           <w:b w:val="0"/>
           <w:sz w:val="21"/>
         </w:rPr>
-        <w:t>Electrical Supplier Website - B2B Platform</w:t>
+        <w:t>Electrical Supplier Website - B2B Platform (solo project)</w:t>
       </w:r>
     </w:p>
     <w:p>
@@ -430,7 +430,7 @@
           <w:b w:val="0"/>
           <w:sz w:val="21"/>
         </w:rPr>
-        <w:t>IODEX - GUI Expense Tracker (desktop application)</w:t>
+        <w:t>IODEX - GUI Expense Tracker (solo project, desktop application)</w:t>
       </w:r>
     </w:p>
     <w:p>

</xml_diff>

<commit_message>
Clean up the Work section: no role tags, quieter HarmonyCare
Three changes requested by the owner.

- Hero: remove the "Current question" block and its now-unused CSS rule
- Work: drop the "Solo project" and "Course team project" chips, the featured
  card's solo role line, and the matching CV markers
- HarmonyCare: role is now "a small part of the architecture work", with the
  application credited to the team. Removed the technical design and testing
  claims from the card, the CV, and the hero lede; the bullets now describe the
  app rather than what the owner did
- README: rules updated so solo work carries no tag and team work is stated in
  plain prose inside the card

Co-authored-by: arena-agent <297053741+arena-agent@users.noreply.github.com>
</commit_message>
<xml_diff>
--- a/cv-ats.docx
+++ b/cv-ats.docx
@@ -85,7 +85,7 @@
           <w:b w:val="0"/>
           <w:sz w:val="21"/>
         </w:rPr>
-        <w:t>Hands-on experience building tested and reproducible software: an adversarial LLM security benchmark, a full-stack B2B web platform, a desktop analytics application, plus team work on an Android safety app (architecture, with some technical design and testing) and a smart-city competition prototype (feature scoping and documentation).</w:t>
+        <w:t>Hands-on experience building tested and reproducible software: an adversarial LLM security benchmark, a full-stack B2B web platform, a desktop analytics application, plus team work on an Android safety app (a small part of the architecture) and a smart-city competition prototype (feature scoping and documentation).</w:t>
       </w:r>
     </w:p>
     <w:p>
@@ -371,7 +371,7 @@
           <w:b w:val="0"/>
           <w:sz w:val="21"/>
         </w:rPr>
-        <w:t>Electrical Supplier Website - B2B Platform (solo project)</w:t>
+        <w:t>Electrical Supplier Website - B2B Platform</w:t>
       </w:r>
     </w:p>
     <w:p>
@@ -430,7 +430,7 @@
           <w:b w:val="0"/>
           <w:sz w:val="21"/>
         </w:rPr>
-        <w:t>IODEX - GUI Expense Tracker (solo project, desktop application)</w:t>
+        <w:t>IODEX - GUI Expense Tracker (desktop application)</w:t>
       </w:r>
     </w:p>
     <w:p>
@@ -502,7 +502,7 @@
           <w:b w:val="0"/>
           <w:sz w:val="21"/>
         </w:rPr>
-        <w:t>- Role: architecture, with smaller contributions to technical design and testing; defined the MVVM and repository layering and the Room data model for the team</w:t>
+        <w:t>- Role: contributed a small part of the architecture work; the application itself was built by the team</w:t>
       </w:r>
     </w:p>
     <w:p>
@@ -514,7 +514,7 @@
           <w:b w:val="0"/>
           <w:sz w:val="21"/>
         </w:rPr>
-        <w:t>- Took part in testing the elderly and volunteer journeys: emergency alerting, map navigation, chat, and reminders</w:t>
+        <w:t>- App structure: MVVM with a repository layer over Room, and a data model of eight entities covering alerts, users, chat, ratings, reminders, and offline operations</w:t>
       </w:r>
     </w:p>
     <w:p>
@@ -526,7 +526,7 @@
           <w:b w:val="0"/>
           <w:sz w:val="21"/>
         </w:rPr>
-        <w:t>- Team-built offline-first path: an alert is queued on the device and broadcast over the local WiFi network, so nearby volunteers can be reached with no server and no internet</w:t>
+        <w:t>- Offline-first alert path: an alert is queued on the device and broadcast over the local WiFi network, so nearby volunteers can be reached with no server and no internet</w:t>
       </w:r>
     </w:p>
     <w:p>

</xml_diff>